<commit_message>
Tony Tornado: revisão da Parte 3
Co-Authored-By: Claude Opus 5.5 <noreply@anthropic.com>
Claude-Session: https://claude.ai/code/session_01MJjUEEZrxQDEUifKK2vj9g
</commit_message>
<xml_diff>
--- a/roteiros/tony-tornado/Tony_Parte3.docx
+++ b/roteiros/tony-tornado/Tony_Parte3.docx
@@ -55,7 +55,15 @@
         <w:rPr>
           <w:color w:val="000000"/>
         </w:rPr>
-        <w:t>Ele voltou com o visual que tinha aprendido nas ruas do Harlem. Uma reportagem descreveu assim a chegada dele: jaqueta aberta, o peito musculoso à mostra, coturno nos pés e o cabelo black, enorme, apontando para o céu.</w:t>
+        <w:t>Na bagagem, ele trazia o que tinha aprendido nas esquinas do Harlem. O orgulho negro dos discursos de rua e o soul de James Brown.</w:t>
+      </w:r>
+    </w:p>
+    <w:p>
+      <w:r>
+        <w:rPr>
+          <w:color w:val="000000"/>
+        </w:rPr>
+        <w:t>Trazia também um visual que o Brasil nunca tinha visto. Uma reportagem descreveu assim a chegada dele: jaqueta aberta, o peito musculoso à mostra, coturno nos pés e o cabelo black, enorme, apontando para o céu.</w:t>
       </w:r>
     </w:p>
     <w:p>
@@ -151,7 +159,7 @@
         <w:rPr>
           <w:color w:val="000000"/>
         </w:rPr>
-        <w:t>Sotaque e jeito de palco, ele tinha de sobra. Foram anos ouvindo James Brown e Ray Charles nas ruas do Harlem.</w:t>
+        <w:t>Jeito de palco, ele tinha de sobra. Foram anos ouvindo James Brown e Ray Charles nas ruas do Harlem.</w:t>
       </w:r>
     </w:p>
     <w:p>
@@ -391,7 +399,7 @@
         <w:rPr>
           <w:color w:val="C00000"/>
         </w:rPr>
-        <w:t>Foi aí que começou a parte mais cruel dessa fase. O mesmo Brasil que aplaudiu Tony no festival logo ia começar a persegui-lo por causa da mulher que ele amava. E um dos homens mais poderosos da imprensa do Rio ia escrever sobre ele uma frase difícil de acreditar.</w:t>
+        <w:t>Foi aí que começou a parte mais cruel dessa fase. O mesmo Brasil que aplaudiu Tony no festival logo ia começar a persegui-lo por causa da mulher que ele amava. E, até hoje, os dois contam esse romance de um jeito tão diferente que parece que viveram duas histórias.</w:t>
       </w:r>
     </w:p>
     <w:p>
@@ -599,7 +607,7 @@
         <w:rPr>
           <w:color w:val="000000"/>
         </w:rPr>
-        <w:t>Um homem negro, de cabelo black, falando de orgulho negro, ao lado de uma mulher branca, e agora acusado nos jornais de fazer propaganda de droga.</w:t>
+        <w:t>Um homem negro, de cabelo black, falando de orgulho negro, ao lado de uma mulher branca, e agora acusado na imprensa de fazer propaganda de droga.</w:t>
       </w:r>
     </w:p>
     <w:p>
@@ -655,7 +663,7 @@
         <w:rPr>
           <w:color w:val="1F4EB4"/>
         </w:rPr>
-        <w:t>Naquela noite, quem estava no palco era Elis Regina. A maior cantora do Brasil.</w:t>
+        <w:t>Naquela noite, quem estava no palco era Elis Regina. Uma das maiores cantoras da história do Brasil.</w:t>
       </w:r>
     </w:p>
     <w:p>
@@ -703,7 +711,7 @@
         <w:rPr>
           <w:color w:val="1F4EB4"/>
         </w:rPr>
-        <w:t>Ao lado de Elis Regina, diante de milhares de pessoas, ele levantou o braço direito com o punho fechado.</w:t>
+        <w:t>Ao lado de Elis Regina, diante de milhares de pessoas, ele levantou o braço com o punho fechado.</w:t>
       </w:r>
     </w:p>
     <w:p>
@@ -711,7 +719,7 @@
         <w:rPr>
           <w:color w:val="1F4EB4"/>
         </w:rPr>
-        <w:t>Era o gesto dos Panteras Negras, o movimento negro americano que ele tinha visto de perto nos anos do Harlem. Em mil novecentos e sessenta e oito, dois atletas negros dos Estados Unidos tinham feito o mesmo gesto no pódio das Olimpíadas do México. A foto correu o mundo.</w:t>
+        <w:t>Era o gesto dos Panteras Negras, o símbolo da luta negra americana que ele tinha acompanhado nos anos do Harlem. Em mil novecentos e sessenta e oito, dois atletas negros dos Estados Unidos tinham feito o mesmo gesto no pódio das Olimpíadas do México. A foto correu o mundo.</w:t>
       </w:r>
     </w:p>
     <w:p>
@@ -775,7 +783,7 @@
         <w:rPr>
           <w:color w:val="C00000"/>
         </w:rPr>
-        <w:t>Depois dessas prisões, veio o golpe mais duro. Tony foi mandado para longe do Brasil, para um exílio que passou por alguns dos países mais fechados do outro lado do mundo.</w:t>
+        <w:t>Depois dessas prisões, veio o golpe mais duro. Tony foi mandado para longe do Brasil, para um exílio que começou aqui do lado, no Uruguai, e o levou até alguns dos países mais fechados do planeta.</w:t>
       </w:r>
     </w:p>
     <w:sectPr>

</xml_diff>